<commit_message>
release v0.1.0: cover date, citation ORCID, image alt-text hygiene, re-seal
- Cover date finalized to July 19, 2026 (release date).

- README citation (BibTeX) carries the author ORCID, matching CITATION.cff.

- Image alt-text (drawing descr) set to accessible labels instead of source paths; a fail-closed build guard now rejects any filesystem path in the DOCX.

- Re-seal: artifact_root 831a6aef... (verify_chain INTACT, 16/16 tests, canon 51/51).
</commit_message>
<xml_diff>
--- a/docs/paper/paper-final.docx
+++ b/docs/paper/paper-final.docx
@@ -17,7 +17,7 @@
               <a:graphicData uri="http://schemas.openxmlformats.org/drawingml/2006/picture">
                 <pic:pic>
                   <pic:nvPicPr>
-                    <pic:cNvPr descr="/Users/ulissesflores/Developer/research-lab/metodo/templates/assets/codex-hash-lockup-stacked@2x.png" id="30" name="Picture"/>
+                    <pic:cNvPr descr="Codex Hash Research Laboratory" id="30" name="Picture"/>
                     <pic:cNvPicPr>
                       <a:picLocks noChangeArrowheads="1" noChangeAspect="1"/>
                     </pic:cNvPicPr>
@@ -122,7 +122,7 @@
         <w:pStyle w:val="CoverInfo"/>
       </w:pPr>
       <w:r>
-        <w:t xml:space="preserve">Date: July 17, 2026</w:t>
+        <w:t xml:space="preserve">Date: July 19, 2026</w:t>
       </w:r>
     </w:p>
     <w:bookmarkStart w:id="31" w:name="abstract"/>
@@ -2029,7 +2029,7 @@
               <a:graphicData uri="http://schemas.openxmlformats.org/drawingml/2006/picture">
                 <pic:pic>
                   <pic:nvPicPr>
-                    <pic:cNvPr descr="../../output/figures/fig1_clusters_per_1k.png" id="37" name="Picture"/>
+                    <pic:cNvPr descr="Figure 1" id="37" name="Picture"/>
                     <pic:cNvPicPr>
                       <a:picLocks noChangeArrowheads="1" noChangeAspect="1"/>
                     </pic:cNvPicPr>
@@ -4667,7 +4667,7 @@
               <a:graphicData uri="http://schemas.openxmlformats.org/drawingml/2006/picture">
                 <pic:pic>
                   <pic:nvPicPr>
-                    <pic:cNvPr descr="../../output/figures/fig2_caching_breakeven.png" id="48" name="Picture"/>
+                    <pic:cNvPr descr="Figure 2" id="48" name="Picture"/>
                     <pic:cNvPicPr>
                       <a:picLocks noChangeArrowheads="1" noChangeAspect="1"/>
                     </pic:cNvPicPr>

</xml_diff>